<commit_message>
Reposition portfolio as UX Engineer with iOS-first Wheely story.
Update site copy, case study, resume, and agent docs; add xcode-tools MCP and dual project links for App Store and web.

Co-authored-by: Cursor <cursoragent@cursor.com>
</commit_message>
<xml_diff>
--- a/NoahMichaelsResume.docx
+++ b/NoahMichaelsResume.docx
@@ -31,7 +31,7 @@
           <w:sz w:val="20"/>
           <w:spacing w:val="40"/>
         </w:rPr>
-        <w:t>UX &amp; PRODUCT DESIGNER</w:t>
+        <w:t>UX ENGINEER</w:t>
       </w:r>
     </w:p>
     <w:p>
@@ -81,6 +81,26 @@
           <w:t>nm.works</w:t>
         </w:r>
       </w:hyperlink>
+      <w:r>
+        <w:rPr>
+          <w:rFonts w:ascii="Univers Next Pro" w:hAnsi="Univers Next Pro"/>
+          <w:b w:val="0"/>
+          <w:i w:val="0"/>
+          <w:color w:val="555555"/>
+          <w:sz w:val="19"/>
+        </w:rPr>
+        <w:t xml:space="preserve">   ·   </w:t>
+      </w:r>
+      <w:hyperlink r:id="rId11">
+        <w:r>
+          <w:rPr>
+            <w:rFonts w:ascii="Univers Next Pro" w:hAnsi="Univers Next Pro"/>
+            <w:sz w:val="19"/>
+            <w:color w:val="555555"/>
+          </w:rPr>
+          <w:t>github.com/noahzm</w:t>
+        </w:r>
+      </w:hyperlink>
     </w:p>
     <w:p>
       <w:pPr>
@@ -113,7 +133,7 @@
           <w:color w:val="1A1A1A"/>
           <w:sz w:val="20"/>
         </w:rPr>
-        <w:t>UX and product designer with 6+ years of experience making dense content easier to use: legislative publications, a print shop’s online ordering, and a weather app that turns forecasts into a plain answer for cyclists. Comfortable in code as well as Figma, so I can build what I design.</w:t>
+        <w:t>UX engineer who designs in code across iOS and web. Six years making legislative template systems, print-shop ordering, and a cycling weather app that turns forecasts into a plain ride verdict. Uses AI-assisted coding tools daily for faster iteration; product and accessibility decisions stay author-led.</w:t>
       </w:r>
     </w:p>
     <w:p>
@@ -160,7 +180,7 @@
           <w:color w:val="1A1A1A"/>
           <w:sz w:val="21"/>
         </w:rPr>
-        <w:t xml:space="preserve"> · Cycling weather decision app</w:t>
+        <w:t xml:space="preserve"> · Native iOS cycling weather app</w:t>
       </w:r>
       <w:r>
         <w:rPr>
@@ -178,7 +198,7 @@
       <w:pPr>
         <w:spacing w:before="0" w:after="40"/>
       </w:pPr>
-      <w:hyperlink r:id="rId11">
+      <w:hyperlink r:id="rId12">
         <w:r>
           <w:rPr>
             <w:rFonts w:ascii="Univers Next Pro" w:hAnsi="Univers Next Pro"/>
@@ -197,7 +217,7 @@
           <w:color w:val="555555"/>
           <w:sz w:val="19"/>
         </w:rPr>
-        <w:t xml:space="preserve">  ·  Astro, React, Tailwind CSS</w:t>
+        <w:t xml:space="preserve">  ·  Swift, SwiftUI · Astro, React, TypeScript</w:t>
       </w:r>
     </w:p>
     <w:p>
@@ -223,7 +243,7 @@
           <w:color w:val="1A1A1A"/>
           <w:sz w:val="20"/>
         </w:rPr>
-        <w:t>Designed a dashboard that answers the question cyclists actually have (ride now, or wait?), turning forecast data into a verdict, hourly windows, best-day picks, and what to wear.</w:t>
+        <w:t>Designed and shipped a native iOS app that answers the question cyclists actually have (ride now, or wait?), with verdict-first UI, hourly windows, best-day picks, and kit guidance.</w:t>
       </w:r>
     </w:p>
     <w:p>
@@ -249,7 +269,33 @@
           <w:color w:val="1A1A1A"/>
           <w:sz w:val="20"/>
         </w:rPr>
-        <w:t>Built and deployed the front end on Cloudflare Pages, pulling forecasts from Open-Meteo and the National Weather Service.</w:t>
+        <w:t>Validated the product model through informal conversations with cyclists; shared forecast logic lives in WheelyCore with accessibility-aware UI.</w:t>
+      </w:r>
+    </w:p>
+    <w:p>
+      <w:pPr>
+        <w:spacing w:before="0" w:after="40"/>
+        <w:ind w:left="259" w:hanging="259"/>
+      </w:pPr>
+      <w:r>
+        <w:rPr>
+          <w:rFonts w:ascii="Univers Next Pro" w:hAnsi="Univers Next Pro"/>
+          <w:b w:val="0"/>
+          <w:i w:val="0"/>
+          <w:color w:val="555555"/>
+          <w:sz w:val="20"/>
+        </w:rPr>
+        <w:t xml:space="preserve">•  </w:t>
+      </w:r>
+      <w:r>
+        <w:rPr>
+          <w:rFonts w:ascii="Univers Next Pro" w:hAnsi="Univers Next Pro"/>
+          <w:b w:val="0"/>
+          <w:i w:val="0"/>
+          <w:color w:val="1A1A1A"/>
+          <w:sz w:val="20"/>
+        </w:rPr>
+        <w:t>Earlier web version on Cloudflare Pages; watchOS companion via WatchConnectivity. App Store submission in progress.</w:t>
       </w:r>
     </w:p>
     <w:p>
@@ -266,7 +312,7 @@
         </w:rPr>
         <w:t xml:space="preserve">Full case studies at </w:t>
       </w:r>
-      <w:hyperlink r:id="rId12">
+      <w:hyperlink r:id="rId13">
         <w:r>
           <w:rPr>
             <w:rFonts w:ascii="Univers Next Pro" w:hAnsi="Univers Next Pro"/>
@@ -359,7 +405,7 @@
           <w:color w:val="1A1A1A"/>
           <w:sz w:val="20"/>
         </w:rPr>
-        <w:t>Built template systems for the cards, postcards, letterhead, and envelopes that 170+ legislators order on repeat, so each job starts from a standard instead of a blank page.</w:t>
+        <w:t>Built template systems for the cards, postcards, letterhead, and envelopes that 170+ legislators order on repeat, reducing rework so each job starts from a standard instead of a blank page.</w:t>
       </w:r>
     </w:p>
     <w:p>
@@ -609,7 +655,7 @@
           <w:color w:val="1A1A1A"/>
           <w:sz w:val="20"/>
         </w:rPr>
-        <w:t>user flows, information architecture, wireframing, prototyping, design systems, accessibility (WCAG, Section 508) · Figma</w:t>
+        <w:t>user flows, information architecture, wireframing, prototyping, design systems, accessibility-aware design · Figma</w:t>
       </w:r>
     </w:p>
     <w:p>
@@ -634,7 +680,32 @@
           <w:color w:val="1A1A1A"/>
           <w:sz w:val="20"/>
         </w:rPr>
-        <w:t>React, Astro, Tailwind CSS, HTML/CSS, WordPress · Git, Claude Code, Cloudflare Pages</w:t>
+        <w:t>Swift, SwiftUI, React, TypeScript, Astro, Tailwind CSS, HTML/CSS · Git, GitHub, Cloudflare Pages</w:t>
+      </w:r>
+    </w:p>
+    <w:p>
+      <w:pPr>
+        <w:spacing w:before="40" w:after="40"/>
+      </w:pPr>
+      <w:r>
+        <w:rPr>
+          <w:rFonts w:ascii="Univers Next Pro" w:hAnsi="Univers Next Pro"/>
+          <w:b/>
+          <w:i w:val="0"/>
+          <w:color w:val="1A1A1A"/>
+          <w:sz w:val="20"/>
+        </w:rPr>
+        <w:t xml:space="preserve">AI-Assisted Development:  </w:t>
+      </w:r>
+      <w:r>
+        <w:rPr>
+          <w:rFonts w:ascii="Univers Next Pro" w:hAnsi="Univers Next Pro"/>
+          <w:b w:val="0"/>
+          <w:i w:val="0"/>
+          <w:color w:val="1A1A1A"/>
+          <w:sz w:val="20"/>
+        </w:rPr>
+        <w:t>Cursor, Claude Code, Codex, OpenCode — agentic design-to-production workflow</w:t>
       </w:r>
     </w:p>
     <w:p>

</xml_diff>